<commit_message>
Mate discreta: capitoli 10-15 (lezione 4, funzioni)
Co-Authored-By: Claude Sonnet 5.5 <noreply@anthropic.com>
</commit_message>
<xml_diff>
--- a/Matematica discreta/Appunti matematica discreta.docx
+++ b/Matematica discreta/Appunti matematica discreta.docx
@@ -7355,6 +7355,2057 @@
       </w:r>
       <w:r>
         <w:t xml:space="preserve">. Se una retta verticale intersecasse la curva in due o più punti, la corrispondenza genererebbe ambiguità e non costituirebbe una funzione valida.</w:t>
+      </w:r>
+    </w:p>
+    <w:p>
+      <w:pPr>
+        <w:pStyle w:val="Titolo1"/>
+      </w:pPr>
+      <w:r>
+        <w:rPr>
+          <w:b/>
+          <w:color w:val="EE0000"/>
+        </w:rPr>
+        <w:t>10. Funzioni: Definizione, Rappresentazioni e Uguaglianza</w:t>
+      </w:r>
+    </w:p>
+    <w:p>
+      <w:pPr>
+        <w:pStyle w:val="Titolo2"/>
+      </w:pPr>
+      <w:r>
+        <w:rPr>
+          <w:b/>
+          <w:color w:val="E97132"/>
+        </w:rPr>
+        <w:t>Dare una funzione significa dare tre oggetti</w:t>
+      </w:r>
+    </w:p>
+    <w:p>
+      <w:r>
+        <w:rPr/>
+        <w:t xml:space="preserve">Come visto nel capitolo 9, una </w:t>
+      </w:r>
+      <w:r>
+        <w:rPr>
+          <w:b/>
+        </w:rPr>
+        <w:t>funzione</w:t>
+      </w:r>
+      <w:r>
+        <w:rPr/>
+        <w:t xml:space="preserve"> (o </w:t>
+      </w:r>
+      <w:r>
+        <w:rPr>
+          <w:b/>
+        </w:rPr>
+        <w:t>applicazione</w:t>
+      </w:r>
+      <w:r>
+        <w:rPr/>
+        <w:t xml:space="preserve">) ha un </w:t>
+      </w:r>
+      <w:r>
+        <w:rPr>
+          <w:b/>
+        </w:rPr>
+        <w:t>dominio</w:t>
+      </w:r>
+      <w:r>
+        <w:rPr/>
+        <w:t xml:space="preserve"> A, un </w:t>
+      </w:r>
+      <w:r>
+        <w:rPr>
+          <w:b/>
+        </w:rPr>
+        <w:t>codominio</w:t>
+      </w:r>
+      <w:r>
+        <w:rPr/>
+        <w:t xml:space="preserve"> B e un </w:t>
+      </w:r>
+      <w:r>
+        <w:rPr>
+          <w:b/>
+        </w:rPr>
+        <w:t>grafico</w:t>
+      </w:r>
+      <w:r>
+        <w:rPr/>
+        <w:t xml:space="preserve"> Γ ⊆ A × B con la condizione di esistenza e unicità ∀ a ∈ A, ∃! b ∈ B tale che (a, b) ∈ Γ; dare una funzione significa dare la tripla (A, B, Γ). Quando (a, b) ∈ Γ si scrive f(a) = b, e le due scritture sono equivalenti. Lettere come f, g, h sono la scelta abituale per i nomi delle funzioni, ma non c'è alcun obbligo. Va notato che A e B possono anche essere lo stesso insieme: fa parte della definizione e capiterà spesso, con lo stesso insieme che una volta gioca da dominio e una volta da codominio.</w:t>
+      </w:r>
+    </w:p>
+    <w:p>
+      <w:pPr>
+        <w:pStyle w:val="Titolo2"/>
+      </w:pPr>
+      <w:r>
+        <w:rPr>
+          <w:b/>
+          <w:color w:val="E97132"/>
+        </w:rPr>
+        <w:t>Un esempio completo su insiemi piccoli</w:t>
+      </w:r>
+    </w:p>
+    <w:p>
+      <w:r>
+        <w:rPr/>
+        <w:t>Prendiamo A = {a, b, c, d} e B = {1, 2, 3}. Il prodotto cartesiano A × B si può disegnare come una piccola scacchiera di 4 × 3 caselle, ciascuna delle quali è una coppia (per esempio una casella rappresenta (c, 2), un'altra (a, 3)). Assegnare un grafico significa scegliere quali caselle appartengono a Γ.</w:t>
+      </w:r>
+    </w:p>
+    <w:p>
+      <w:r>
+        <w:rPr/>
+        <w:t>Se segniamo le caselle (a, 2), (b, 2), (c, 3), (d, 1), sopra ogni elemento di A c'è esattamente una casella segnata: Γ definisce una funzione, con f(a) = 2, f(b) = 2, f(c) = 3, f(d) = 1. Si noti che 2 compare due volte come valore, e non è un problema: la definizione chiede un solo valore per ogni elemento del dominio, non valori diversi.</w:t>
+      </w:r>
+    </w:p>
+    <w:p>
+      <w:r>
+        <w:rPr/>
+        <w:t>Questa descrizione a scacchiera serve a capire la definizione, ma nella pratica non si scrive così: se non c'è una formula che esprima la funzione, il modo più rapido è assegnare direttamente a ogni elemento del dominio il suo valore.</w:t>
+      </w:r>
+    </w:p>
+    <w:p>
+      <w:pPr>
+        <w:pStyle w:val="Titolo2"/>
+      </w:pPr>
+      <w:r>
+        <w:rPr>
+          <w:b/>
+          <w:color w:val="E97132"/>
+        </w:rPr>
+        <w:t>Cosa NON è una funzione</w:t>
+      </w:r>
+    </w:p>
+    <w:p>
+      <w:r>
+        <w:rPr/>
+        <w:t>Sulla scacchiera la condizione di esistenza e unicità può fallire in due modi: se sopra un elemento di A non c'è nessuna casella segnata manca l'esistenza, se ce ne sono due o più manca l'unicità. Nell'esempio precedente, se avessimo segnato due caselle sopra l'elemento b, il valore di f in b sarebbe ambiguo e Γ non definirebbe una funzione.</w:t>
+      </w:r>
+    </w:p>
+    <w:p>
+      <w:pPr>
+        <w:pStyle w:val="Titolo2"/>
+      </w:pPr>
+      <w:r>
+        <w:rPr>
+          <w:b/>
+          <w:color w:val="E97132"/>
+        </w:rPr>
+        <w:t>Differenza rispetto alla funzione di analisi</w:t>
+      </w:r>
+    </w:p>
+    <w:p>
+      <w:r>
+        <w:rPr/>
+        <w:t xml:space="preserve">Chi è abituato alle funzioni reali di variabile reale parte sempre dal calcolare il dominio come insieme dei punti in cui l'espressione ha senso (denominatore diverso da zero, radicando maggiore o uguale a zero e così via). Qui questo passo non esiste: il dominio </w:t>
+      </w:r>
+      <w:r>
+        <w:rPr>
+          <w:b/>
+        </w:rPr>
+        <w:t>viene assegnato</w:t>
+      </w:r>
+      <w:r>
+        <w:rPr/>
+        <w:t xml:space="preserve"> insieme alla funzione, e si richiede che il valore f(a) esista per ogni a del dominio scelto. Dire "f(a) = b" deve essere sempre possibile, qualunque sia a ∈ A.</w:t>
+      </w:r>
+    </w:p>
+    <w:p>
+      <w:pPr>
+        <w:pStyle w:val="Titolo2"/>
+      </w:pPr>
+      <w:r>
+        <w:rPr>
+          <w:b/>
+          <w:color w:val="E97132"/>
+        </w:rPr>
+        <w:t>Le notazioni a freccia</w:t>
+      </w:r>
+    </w:p>
+    <w:p>
+      <w:r>
+        <w:rPr/>
+        <w:t xml:space="preserve">Una funzione si scrive quasi sempre f : A → B, che dice in un colpo solo dominio e codominio. Il nome si può anche mettere sopra la freccia, A →(f) B: è comodo quando si hanno più funzioni nello stesso diagramma, per esempio due funzioni f e g entrambe da A in B. Per questo motivo si parla spesso di </w:t>
+      </w:r>
+      <w:r>
+        <w:rPr>
+          <w:b/>
+        </w:rPr>
+        <w:t>freccia</w:t>
+      </w:r>
+      <w:r>
+        <w:rPr/>
+        <w:t xml:space="preserve"> (o di </w:t>
+      </w:r>
+      <w:r>
+        <w:rPr>
+          <w:b/>
+        </w:rPr>
+        <w:t>mappa</w:t>
+      </w:r>
+      <w:r>
+        <w:rPr/>
+        <w:t>) per indicare una funzione.</w:t>
+      </w:r>
+    </w:p>
+    <w:p>
+      <w:r>
+        <w:rPr/>
+        <w:t>Per descrivere il singolo elemento si usa la freccia con il trattino, x ↦ f(x), che si legge "x va in f(x)": per esempio n ↦ a</w:t>
+      </w:r>
+      <w:r>
+        <w:rPr>
+          <w:vertAlign w:val="subscript"/>
+        </w:rPr>
+        <w:t>n</w:t>
+      </w:r>
+      <w:r>
+        <w:rPr/>
+        <w:t xml:space="preserve"> associa a ogni naturale n un numero reale.</w:t>
+      </w:r>
+    </w:p>
+    <w:p>
+      <w:pPr>
+        <w:pStyle w:val="Titolo2"/>
+      </w:pPr>
+      <w:r>
+        <w:rPr>
+          <w:b/>
+          <w:color w:val="E97132"/>
+        </w:rPr>
+        <w:t>Rappresentazione con i diagrammi di Venn</w:t>
+      </w:r>
+    </w:p>
+    <w:p>
+      <w:r>
+        <w:rPr/>
+        <w:t xml:space="preserve">Una funzione si può rappresentare con due ovali, uno per A e uno per B, e una freccia da ogni punto x del dominio al punto y = f(x) del codominio. Anche quando A = B conviene </w:t>
+      </w:r>
+      <w:r>
+        <w:rPr>
+          <w:b/>
+        </w:rPr>
+        <w:t>disegnare due copie separate</w:t>
+      </w:r>
+      <w:r>
+        <w:rPr/>
+        <w:t xml:space="preserve"> dell'insieme, una come dominio e una come codominio. Un modo intuitivo di pensare a una funzione è come a una scatola con un'entrata e un'uscita: dentro entra un elemento del dominio e ne esce uno del codominio.</w:t>
+      </w:r>
+    </w:p>
+    <w:p>
+      <w:pPr>
+        <w:pStyle w:val="Titolo2"/>
+      </w:pPr>
+      <w:r>
+        <w:rPr>
+          <w:b/>
+          <w:color w:val="E97132"/>
+        </w:rPr>
+        <w:t>Quando due funzioni sono uguali</w:t>
+      </w:r>
+    </w:p>
+    <w:p>
+      <w:r>
+        <w:rPr/>
+        <w:t xml:space="preserve">Dare una funzione significa dare tutti e tre gli oggetti (A, B, Γ), quindi f = (A, B, Γ) e g = (A′, B′, Γ′) sono </w:t>
+      </w:r>
+      <w:r>
+        <w:rPr>
+          <w:b/>
+        </w:rPr>
+        <w:t>uguali</w:t>
+      </w:r>
+      <w:r>
+        <w:rPr/>
+        <w:t xml:space="preserve"> se e solo se coincidono tutti e tre: A = A′, B = B′ e Γ = Γ′. Non basta avere la stessa espressione, e non basta nemmeno avere gli stessi valori: servono anche lo stesso dominio e lo stesso codominio.</w:t>
+      </w:r>
+    </w:p>
+    <w:p>
+      <w:r>
+        <w:rPr/>
+        <w:t>Un esempio fa vedere l'effetto contrario. Sull'insieme {0, 1, 2} (con codominio ℝ) consideriamo f(x) = 3x² − 1 e g(x) = x³ + 2x − 1. Le due espressioni sono diverse, ma:</w:t>
+      </w:r>
+    </w:p>
+    <w:p>
+      <w:pPr>
+        <w:numPr>
+          <w:ilvl w:val="0"/>
+          <w:numId w:val="1"/>
+        </w:numPr>
+      </w:pPr>
+      <w:r>
+        <w:rPr/>
+        <w:t>f(0) = −1 e g(0) = −1;</w:t>
+      </w:r>
+    </w:p>
+    <w:p>
+      <w:pPr>
+        <w:numPr>
+          <w:ilvl w:val="0"/>
+          <w:numId w:val="1"/>
+        </w:numPr>
+      </w:pPr>
+      <w:r>
+        <w:rPr/>
+        <w:t>f(1) = 2 e g(1) = 2;</w:t>
+      </w:r>
+    </w:p>
+    <w:p>
+      <w:pPr>
+        <w:numPr>
+          <w:ilvl w:val="0"/>
+          <w:numId w:val="1"/>
+        </w:numPr>
+      </w:pPr>
+      <w:r>
+        <w:rPr/>
+        <w:t>f(2) = 11 e g(2) = 8 + 4 − 1 = 11.</w:t>
+      </w:r>
+    </w:p>
+    <w:p>
+      <w:r>
+        <w:rPr/>
+        <w:t xml:space="preserve">Hanno lo stesso dominio, lo stesso codominio e lo stesso grafico, quindi </w:t>
+      </w:r>
+      <w:r>
+        <w:rPr>
+          <w:b/>
+        </w:rPr>
+        <w:t>f = g</w:t>
+      </w:r>
+      <w:r>
+        <w:rPr/>
+        <w:t xml:space="preserve"> pur essendo scritte con espressioni diverse. A lezione è stato accennato che fenomeni di questo tipo si incontrano nello studio dei campi finiti in crittografia.</w:t>
+      </w:r>
+    </w:p>
+    <w:p>
+      <w:r>
+        <w:rPr>
+          <w:b/>
+        </w:rPr>
+        <w:t>Trabocchetto d'esame:</w:t>
+      </w:r>
+      <w:r>
+        <w:rPr/>
+        <w:t xml:space="preserve"> assegnare una funzione dando solo un'espressione da calcolare non è abbastanza preciso. Se si vogliono studiare proprietà come iniettività e suriettività bisogna sempre specificare dominio e codominio, perché cambiandoli la stessa espressione può dare funzioni con proprietà diverse (lo vedremo nel capitolo 14).</w:t>
+      </w:r>
+    </w:p>
+    <w:p>
+      <w:r>
+        <w:rPr/>
+        <w:t>Dopo l'uguaglianza vediamo le funzioni che compaiono di continuo, e due costruzioni elementari: successioni e restrizioni.</w:t>
+      </w:r>
+    </w:p>
+    <w:p>
+      <w:pPr>
+        <w:pStyle w:val="Titolo1"/>
+      </w:pPr>
+      <w:r>
+        <w:rPr>
+          <w:b/>
+          <w:color w:val="EE0000"/>
+        </w:rPr>
+        <w:t>11. Funzioni Notevoli, Successioni e Restrizione</w:t>
+      </w:r>
+    </w:p>
+    <w:p>
+      <w:pPr>
+        <w:pStyle w:val="Titolo2"/>
+      </w:pPr>
+      <w:r>
+        <w:rPr>
+          <w:b/>
+          <w:color w:val="E97132"/>
+        </w:rPr>
+        <w:t>Le funzioni che ricorrono sempre</w:t>
+      </w:r>
+    </w:p>
+    <w:p>
+      <w:r>
+        <w:rPr/>
+        <w:t>Esiste un piccolo elenco di funzioni standard che conviene conoscere, perché compaiono continuamente, spesso in modo implicito. Per definirle indichiamo a parole come si comporta il valore invece di scrivere esplicitamente il grafico Γ, che sarebbe macchinoso: è però importante ricordare che dietro c'è sempre la tripla (A, B, Γ).</w:t>
+      </w:r>
+    </w:p>
+    <w:p>
+      <w:pPr>
+        <w:pStyle w:val="Titolo2"/>
+      </w:pPr>
+      <w:r>
+        <w:rPr>
+          <w:b/>
+          <w:color w:val="E97132"/>
+        </w:rPr>
+        <w:t>Funzione identità</w:t>
+      </w:r>
+    </w:p>
+    <w:p>
+      <w:r>
+        <w:rPr/>
+        <w:t xml:space="preserve">Per ogni insieme A, la </w:t>
+      </w:r>
+      <w:r>
+        <w:rPr>
+          <w:b/>
+        </w:rPr>
+        <w:t>funzione identità</w:t>
+      </w:r>
+      <w:r>
+        <w:rPr/>
+        <w:t xml:space="preserve"> id</w:t>
+      </w:r>
+      <w:r>
+        <w:rPr>
+          <w:vertAlign w:val="subscript"/>
+        </w:rPr>
+        <w:t>A</w:t>
+      </w:r>
+      <w:r>
+        <w:rPr/>
+        <w:t xml:space="preserve"> : A → A è definita da id</w:t>
+      </w:r>
+      <w:r>
+        <w:rPr>
+          <w:vertAlign w:val="subscript"/>
+        </w:rPr>
+        <w:t>A</w:t>
+      </w:r>
+      <w:r>
+        <w:rPr/>
+        <w:t xml:space="preserve">(a) = a per ogni a ∈ A. Il pedice A serve perché l'identità esiste per qualunque insieme. Nell'immagine della scatola è quella che restituisce l'oggetto in entrata tale e quale, senza fargli nulla. Il suo grafico è la </w:t>
+      </w:r>
+      <w:r>
+        <w:rPr>
+          <w:b/>
+        </w:rPr>
+        <w:t>diagonale</w:t>
+      </w:r>
+      <w:r>
+        <w:rPr/>
+        <w:t xml:space="preserve"> Δ = {(a, a) | a ∈ A}.</w:t>
+      </w:r>
+    </w:p>
+    <w:p>
+      <w:pPr>
+        <w:pStyle w:val="Titolo2"/>
+      </w:pPr>
+      <w:r>
+        <w:rPr>
+          <w:b/>
+          <w:color w:val="E97132"/>
+        </w:rPr>
+        <w:t>Funzione costante</w:t>
+      </w:r>
+    </w:p>
+    <w:p>
+      <w:r>
+        <w:rPr/>
+        <w:t xml:space="preserve">Si scelgono due insiemi A e B e un elemento β ∈ B fissato. La </w:t>
+      </w:r>
+      <w:r>
+        <w:rPr>
+          <w:b/>
+        </w:rPr>
+        <w:t>funzione costante</w:t>
+      </w:r>
+      <w:r>
+        <w:rPr/>
+        <w:t xml:space="preserve"> f</w:t>
+      </w:r>
+      <w:r>
+        <w:rPr>
+          <w:vertAlign w:val="subscript"/>
+        </w:rPr>
+        <w:t>β</w:t>
+      </w:r>
+      <w:r>
+        <w:rPr/>
+        <w:t xml:space="preserve"> : A → B è definita da f</w:t>
+      </w:r>
+      <w:r>
+        <w:rPr>
+          <w:vertAlign w:val="subscript"/>
+        </w:rPr>
+        <w:t>β</w:t>
+      </w:r>
+      <w:r>
+        <w:rPr/>
+        <w:t>(a) = β per ogni a ∈ A: qualunque cosa si inserisca nella scatola, esce sempre β. Per le funzioni numeriche il grafico è una retta orizzontale.</w:t>
+      </w:r>
+    </w:p>
+    <w:p>
+      <w:pPr>
+        <w:pStyle w:val="Titolo2"/>
+      </w:pPr>
+      <w:r>
+        <w:rPr>
+          <w:b/>
+          <w:color w:val="E97132"/>
+        </w:rPr>
+        <w:t>Proiezioni</w:t>
+      </w:r>
+    </w:p>
+    <w:p>
+      <w:r>
+        <w:rPr/>
+        <w:t>Dati A e B, sul prodotto cartesiano A × B si definiscono due funzioni:</w:t>
+      </w:r>
+    </w:p>
+    <w:p>
+      <w:pPr>
+        <w:numPr>
+          <w:ilvl w:val="0"/>
+          <w:numId w:val="1"/>
+        </w:numPr>
+      </w:pPr>
+      <w:r>
+        <w:rPr/>
+        <w:t xml:space="preserve">la </w:t>
+      </w:r>
+      <w:r>
+        <w:rPr>
+          <w:b/>
+        </w:rPr>
+        <w:t>prima proiezione</w:t>
+      </w:r>
+      <w:r>
+        <w:rPr/>
+        <w:t xml:space="preserve"> p</w:t>
+      </w:r>
+      <w:r>
+        <w:rPr>
+          <w:vertAlign w:val="subscript"/>
+        </w:rPr>
+        <w:t>1</w:t>
+      </w:r>
+      <w:r>
+        <w:rPr/>
+        <w:t xml:space="preserve"> : A × B → A, con p</w:t>
+      </w:r>
+      <w:r>
+        <w:rPr>
+          <w:vertAlign w:val="subscript"/>
+        </w:rPr>
+        <w:t>1</w:t>
+      </w:r>
+      <w:r>
+        <w:rPr/>
+        <w:t>(a, b) = a (restituisce la prima componente della coppia);</w:t>
+      </w:r>
+    </w:p>
+    <w:p>
+      <w:pPr>
+        <w:numPr>
+          <w:ilvl w:val="0"/>
+          <w:numId w:val="1"/>
+        </w:numPr>
+      </w:pPr>
+      <w:r>
+        <w:rPr/>
+        <w:t xml:space="preserve">la </w:t>
+      </w:r>
+      <w:r>
+        <w:rPr>
+          <w:b/>
+        </w:rPr>
+        <w:t>seconda proiezione</w:t>
+      </w:r>
+      <w:r>
+        <w:rPr/>
+        <w:t xml:space="preserve"> p</w:t>
+      </w:r>
+      <w:r>
+        <w:rPr>
+          <w:vertAlign w:val="subscript"/>
+        </w:rPr>
+        <w:t>2</w:t>
+      </w:r>
+      <w:r>
+        <w:rPr/>
+        <w:t xml:space="preserve"> : A × B → B, con p</w:t>
+      </w:r>
+      <w:r>
+        <w:rPr>
+          <w:vertAlign w:val="subscript"/>
+        </w:rPr>
+        <w:t>2</w:t>
+      </w:r>
+      <w:r>
+        <w:rPr/>
+        <w:t>(a, b) = b (restituisce la seconda componente).</w:t>
+      </w:r>
+    </w:p>
+    <w:p>
+      <w:r>
+        <w:rPr/>
+        <w:t>Il nome viene dal piano cartesiano: p</w:t>
+      </w:r>
+      <w:r>
+        <w:rPr>
+          <w:vertAlign w:val="subscript"/>
+        </w:rPr>
+        <w:t>1</w:t>
+      </w:r>
+      <w:r>
+        <w:rPr/>
+        <w:t xml:space="preserve"> proietta il punto di coordinate (a, b) sull'asse delle ascisse, p</w:t>
+      </w:r>
+      <w:r>
+        <w:rPr>
+          <w:vertAlign w:val="subscript"/>
+        </w:rPr>
+        <w:t>2</w:t>
+      </w:r>
+      <w:r>
+        <w:rPr/>
+        <w:t xml:space="preserve"> sull'asse delle ordinate. Con un prodotto di più insiemi A × B × C si hanno anche la terza proiezione, la quarta e così via: in generale, per le n-uple, restituiscono una coordinata fissata, come le componenti di un vettore.</w:t>
+      </w:r>
+    </w:p>
+    <w:p>
+      <w:pPr>
+        <w:pStyle w:val="Titolo2"/>
+      </w:pPr>
+      <w:r>
+        <w:rPr>
+          <w:b/>
+          <w:color w:val="E97132"/>
+        </w:rPr>
+        <w:t>Inclusione canonica</w:t>
+      </w:r>
+    </w:p>
+    <w:p>
+      <w:r>
+        <w:rPr/>
+        <w:t>Se S ⊆ A, l'</w:t>
+      </w:r>
+      <w:r>
+        <w:rPr>
+          <w:b/>
+        </w:rPr>
+        <w:t>inclusione canonica</w:t>
+      </w:r>
+      <w:r>
+        <w:rPr/>
+        <w:t xml:space="preserve"> j : S → A è definita da j(s) = s per ogni s ∈ S. Manda ogni s in sé stesso; se S = A coincide con id</w:t>
+      </w:r>
+      <w:r>
+        <w:rPr>
+          <w:vertAlign w:val="subscript"/>
+        </w:rPr>
+        <w:t>A</w:t>
+      </w:r>
+      <w:r>
+        <w:rPr/>
+        <w:t>.</w:t>
+      </w:r>
+    </w:p>
+    <w:p>
+      <w:pPr>
+        <w:pStyle w:val="Titolo2"/>
+      </w:pPr>
+      <w:r>
+        <w:rPr>
+          <w:b/>
+          <w:color w:val="E97132"/>
+        </w:rPr>
+        <w:t>Le successioni come funzioni</w:t>
+      </w:r>
+    </w:p>
+    <w:p>
+      <w:r>
+        <w:rPr/>
+        <w:t xml:space="preserve">Una </w:t>
+      </w:r>
+      <w:r>
+        <w:rPr>
+          <w:b/>
+        </w:rPr>
+        <w:t>successione</w:t>
+      </w:r>
+      <w:r>
+        <w:rPr/>
+        <w:t xml:space="preserve"> è una lista di numeri a</w:t>
+      </w:r>
+      <w:r>
+        <w:rPr>
+          <w:vertAlign w:val="subscript"/>
+        </w:rPr>
+        <w:t>0</w:t>
+      </w:r>
+      <w:r>
+        <w:rPr/>
+        <w:t>, a</w:t>
+      </w:r>
+      <w:r>
+        <w:rPr>
+          <w:vertAlign w:val="subscript"/>
+        </w:rPr>
+        <w:t>1</w:t>
+      </w:r>
+      <w:r>
+        <w:rPr/>
+        <w:t>, a</w:t>
+      </w:r>
+      <w:r>
+        <w:rPr>
+          <w:vertAlign w:val="subscript"/>
+        </w:rPr>
+        <w:t>2</w:t>
+      </w:r>
+      <w:r>
+        <w:rPr/>
+        <w:t>, … (si può partire da 0 o da 1, è irrilevante). Assegnare una successione di numeri reali significa assegnare un valore reale a 0, uno a 1, uno a 2 e così via, cioè definire una funzione</w:t>
+      </w:r>
+    </w:p>
+    <w:p>
+      <w:r>
+        <w:rPr/>
+        <w:t>a : ℕ → ℝ, n ↦ a</w:t>
+      </w:r>
+      <w:r>
+        <w:rPr>
+          <w:vertAlign w:val="subscript"/>
+        </w:rPr>
+        <w:t>n</w:t>
+      </w:r>
+      <w:r>
+        <w:rPr/>
+        <w:t>.</w:t>
+      </w:r>
+    </w:p>
+    <w:p>
+      <w:r>
+        <w:rPr/>
+        <w:t>Dunque una successione non è altro che una funzione con dominio ℕ e codominio ℝ. Un esempio di successione è quella di Fibonacci.</w:t>
+      </w:r>
+    </w:p>
+    <w:p>
+      <w:pPr>
+        <w:pStyle w:val="Titolo2"/>
+      </w:pPr>
+      <w:r>
+        <w:rPr>
+          <w:b/>
+          <w:color w:val="E97132"/>
+        </w:rPr>
+        <w:t>La restrizione di una funzione</w:t>
+      </w:r>
+    </w:p>
+    <w:p>
+      <w:r>
+        <w:rPr/>
+        <w:t xml:space="preserve">Sia f : A → B una funzione e sia S ⊆ A un sottoinsieme del dominio. Poiché gli elementi di S sono particolari elementi di A, f assume un valore anche su di essi. Possiamo allora definire una </w:t>
+      </w:r>
+      <w:r>
+        <w:rPr>
+          <w:b/>
+        </w:rPr>
+        <w:t>nuova funzione</w:t>
+      </w:r>
+      <w:r>
+        <w:rPr/>
+        <w:t xml:space="preserve"> f|</w:t>
+      </w:r>
+      <w:r>
+        <w:rPr>
+          <w:vertAlign w:val="subscript"/>
+        </w:rPr>
+        <w:t>S</w:t>
+      </w:r>
+      <w:r>
+        <w:rPr/>
+        <w:t xml:space="preserve"> : S → B, la </w:t>
+      </w:r>
+      <w:r>
+        <w:rPr>
+          <w:b/>
+        </w:rPr>
+        <w:t>restrizione di f a S</w:t>
+      </w:r>
+      <w:r>
+        <w:rPr/>
+        <w:t>, con la stessa regola di prima: f|</w:t>
+      </w:r>
+      <w:r>
+        <w:rPr>
+          <w:vertAlign w:val="subscript"/>
+        </w:rPr>
+        <w:t>S</w:t>
+      </w:r>
+      <w:r>
+        <w:rPr/>
+        <w:t>(s) = f(s) per ogni s ∈ S.</w:t>
+      </w:r>
+    </w:p>
+    <w:p>
+      <w:r>
+        <w:rPr/>
+        <w:t xml:space="preserve">Si sta restringendo il dominio, lasciando invariati i valori; ma dal punto di vista concettuale </w:t>
+      </w:r>
+      <w:r>
+        <w:rPr>
+          <w:b/>
+        </w:rPr>
+        <w:t>f|</w:t>
+      </w:r>
+      <w:r>
+        <w:rPr>
+          <w:b/>
+          <w:vertAlign w:val="subscript"/>
+        </w:rPr>
+        <w:t>S</w:t>
+      </w:r>
+      <w:r>
+        <w:rPr>
+          <w:b/>
+        </w:rPr>
+        <w:t xml:space="preserve"> è una funzione diversa da f</w:t>
+      </w:r>
+      <w:r>
+        <w:rPr/>
+        <w:t>, perché ha un dominio diverso (si ricordi il criterio di uguaglianza del capitolo 10).</w:t>
+      </w:r>
+    </w:p>
+    <w:p>
+      <w:pPr>
+        <w:pStyle w:val="Titolo2"/>
+      </w:pPr>
+      <w:r>
+        <w:rPr>
+          <w:b/>
+          <w:color w:val="E97132"/>
+        </w:rPr>
+        <w:t>Funzioni diverse con restrizioni uguali</w:t>
+      </w:r>
+    </w:p>
+    <w:p>
+      <w:r>
+        <w:rPr/>
+        <w:t>Non è vero che due funzioni diverse restano diverse dopo la restrizione. Riprendiamo l'esempio del capitolo 10: le espressioni f(x) = 3x² − 1 e g(x) = x³ + 2x − 1 sono definite per ogni numero reale e, come funzioni su ℝ, sono diverse (hanno grafici diversi). Se però le restringiamo a S = {0, 1, 2}, diventano uguali: f|</w:t>
+      </w:r>
+      <w:r>
+        <w:rPr>
+          <w:vertAlign w:val="subscript"/>
+        </w:rPr>
+        <w:t>S</w:t>
+      </w:r>
+      <w:r>
+        <w:rPr/>
+        <w:t xml:space="preserve"> = g|</w:t>
+      </w:r>
+      <w:r>
+        <w:rPr>
+          <w:vertAlign w:val="subscript"/>
+        </w:rPr>
+        <w:t>S</w:t>
+      </w:r>
+      <w:r>
+        <w:rPr/>
+        <w:t>.</w:t>
+      </w:r>
+    </w:p>
+    <w:p>
+      <w:r>
+        <w:rPr/>
+        <w:t>Lo stesso accade graficamente con due funzioni reali i cui grafici coincidono solo su un intervallo [a, b]: sono diverse su ℝ, ma se le restringiamo a S = [a, b] si ottengono due funzioni uguali. Non è detto che succeda: è una possibilità, e vedremo più avanti perché a volte conviene restringere il dominio apposta.</w:t>
+      </w:r>
+    </w:p>
+    <w:p>
+      <w:r>
+        <w:rPr/>
+        <w:t>Il prossimo capitolo affronta una questione molto più delicata, che riguarda le funzioni definite su un insieme quoziente.</w:t>
+      </w:r>
+    </w:p>
+    <w:p>
+      <w:pPr>
+        <w:pStyle w:val="Titolo1"/>
+      </w:pPr>
+      <w:r>
+        <w:rPr>
+          <w:b/>
+          <w:color w:val="EE0000"/>
+        </w:rPr>
+        <w:t>12. Funzioni sull'Insieme Quoziente e Dipendenza dal Rappresentante</w:t>
+      </w:r>
+    </w:p>
+    <w:p>
+      <w:pPr>
+        <w:pStyle w:val="Titolo2"/>
+      </w:pPr>
+      <w:r>
+        <w:rPr>
+          <w:b/>
+          <w:color w:val="E97132"/>
+        </w:rPr>
+        <w:t>Il problema</w:t>
+      </w:r>
+    </w:p>
+    <w:p>
+      <w:r>
+        <w:rPr/>
+        <w:t>Come visto nel capitolo 9, una relazione di equivalenza R su un insieme A divide A in classi di equivalenza e dà l'</w:t>
+      </w:r>
+      <w:r>
+        <w:rPr>
+          <w:b/>
+        </w:rPr>
+        <w:t>insieme quoziente</w:t>
+      </w:r>
+      <w:r>
+        <w:rPr/>
+        <w:t xml:space="preserve"> Q, i cui elementi sono le classi. Un elemento x ∈ A individua la sua classe, che indichiamo con [x] oppure con x̄ (a volte anche C</w:t>
+      </w:r>
+      <w:r>
+        <w:rPr>
+          <w:vertAlign w:val="subscript"/>
+        </w:rPr>
+        <w:t>x</w:t>
+      </w:r>
+      <w:r>
+        <w:rPr/>
+        <w:t>): sono modi alternativi di scrivere la stessa cosa, e le notazioni semplici contano, perché scegliere il simbolismo giusto aiuta a capire.</w:t>
+      </w:r>
+    </w:p>
+    <w:p>
+      <w:r>
+        <w:rPr/>
+        <w:t>Questa situazione è molto frequente in matematica e porta a una questione delicata, che a lezione è stata indicata come forse il punto concettualmente più difficile del corso. Supponiamo di voler definire una funzione da Q in Q, cioè di associare a ogni classe un'altra classe, e di farlo dicendo "alla classe di x associo la classe di una certa espressione in x".</w:t>
+      </w:r>
+    </w:p>
+    <w:p>
+      <w:pPr>
+        <w:pStyle w:val="Titolo2"/>
+      </w:pPr>
+      <w:r>
+        <w:rPr>
+          <w:b/>
+          <w:color w:val="E97132"/>
+        </w:rPr>
+        <w:t>Il difetto: molti modi per scrivere la stessa classe</w:t>
+      </w:r>
+    </w:p>
+    <w:p>
+      <w:r>
+        <w:rPr/>
+        <w:t xml:space="preserve">Una classe si può scrivere in tanti modi, uno per ogni suo rappresentante, e nessuno è privilegiato: per esempio, nell'esempio qui sotto [3] = [5] = [7]. Ma una funzione deve assumere </w:t>
+      </w:r>
+      <w:r>
+        <w:rPr>
+          <w:b/>
+        </w:rPr>
+        <w:t>un solo valore ben specificato</w:t>
+      </w:r>
+      <w:r>
+        <w:rPr/>
+        <w:t xml:space="preserve"> su ciascun elemento del dominio. Se la regola usa il rappresentante scelto, il risultato </w:t>
+      </w:r>
+      <w:r>
+        <w:rPr>
+          <w:b/>
+        </w:rPr>
+        <w:t>non deve dipendere dal modo in cui si scrive la classe</w:t>
+      </w:r>
+      <w:r>
+        <w:rPr/>
+        <w:t>: altrimenti, scrivendo la stessa classe in due modi, si otterrebbero due valori diversi e non si avrebbe una funzione.</w:t>
+      </w:r>
+    </w:p>
+    <w:p>
+      <w:pPr>
+        <w:pStyle w:val="Titolo2"/>
+      </w:pPr>
+      <w:r>
+        <w:rPr>
+          <w:b/>
+          <w:color w:val="E97132"/>
+        </w:rPr>
+        <w:t>Un esempio che non funziona</w:t>
+      </w:r>
+    </w:p>
+    <w:p>
+      <w:r>
+        <w:rPr/>
+        <w:t>Sia A = ℕ e dividiamolo in classi mettendo insieme i numeri che in notazione decimale hanno lo stesso numero di cifre: {0, …, 9} (una cifra), {10, …, 99} (due cifre), {100, …, 999} (tre cifre) e così via. Allora [3] = {0, …, 9} e [2026] è l'insieme dei numeri con quattro cifre, da 1000 a 9999. Due numeri sono equivalenti quando si scrivono con lo stesso numero di cifre.</w:t>
+      </w:r>
+    </w:p>
+    <w:p>
+      <w:r>
+        <w:rPr/>
+        <w:t>Proviamo a definire F : Q → Q con la regola F([x]) = [2x]: alla classe di 2 associo quella di 4, alla classe di 15 quella di 30, e così via. Questa regola non definisce una funzione. Infatti 3 e 8 hanno una cifra, quindi [3] = [8], ma:</w:t>
+      </w:r>
+    </w:p>
+    <w:p>
+      <w:pPr>
+        <w:numPr>
+          <w:ilvl w:val="0"/>
+          <w:numId w:val="1"/>
+        </w:numPr>
+      </w:pPr>
+      <w:r>
+        <w:rPr/>
+        <w:t>F([3]) = [6] (una cifra);</w:t>
+      </w:r>
+    </w:p>
+    <w:p>
+      <w:pPr>
+        <w:numPr>
+          <w:ilvl w:val="0"/>
+          <w:numId w:val="1"/>
+        </w:numPr>
+      </w:pPr>
+      <w:r>
+        <w:rPr/>
+        <w:t>F([8]) = [16] (due cifre).</w:t>
+      </w:r>
+    </w:p>
+    <w:p>
+      <w:r>
+        <w:rPr/>
+        <w:t>Dato che [6] ≠ [16], la stessa classe verrebbe mandata in due classi diverse. Il motivo è che 3 ∼ 8 non implica 2·3 ∼ 2·8: raddoppiare non rispetta l'equivalenza.</w:t>
+      </w:r>
+    </w:p>
+    <w:p>
+      <w:pPr>
+        <w:pStyle w:val="Titolo2"/>
+      </w:pPr>
+      <w:r>
+        <w:rPr>
+          <w:b/>
+          <w:color w:val="E97132"/>
+        </w:rPr>
+        <w:t>Che cosa bisogna verificare</w:t>
+      </w:r>
+    </w:p>
+    <w:p>
+      <w:r>
+        <w:rPr/>
+        <w:t xml:space="preserve">Quando si definisce una funzione su un insieme quoziente tramite i rappresentanti bisogna sempre controllare che la regola sia </w:t>
+      </w:r>
+      <w:r>
+        <w:rPr>
+          <w:b/>
+        </w:rPr>
+        <w:t>ben definita</w:t>
+      </w:r>
+      <w:r>
+        <w:rPr/>
+        <w:t xml:space="preserve"> (termine usuale): se x ∼ y, la regola deve dare lo stesso risultato su x e su y, cioè la classe di arrivo non deve cambiare cambiando rappresentante. Il tema tornerà verso la fine del corso con casi concreti, dove la verifica diventa un vero problema da risolvere.</w:t>
+      </w:r>
+    </w:p>
+    <w:p>
+      <w:r>
+        <w:rPr>
+          <w:b/>
+        </w:rPr>
+        <w:t>Come sottolineato a lezione:</w:t>
+      </w:r>
+      <w:r>
+        <w:rPr/>
+        <w:t xml:space="preserve"> quando una funzione è definita "sulla classe di x" tramite una formula in x, la prima domanda è sempre se il risultato dipende dal rappresentante.</w:t>
+      </w:r>
+    </w:p>
+    <w:p>
+      <w:pPr>
+        <w:pStyle w:val="Titolo1"/>
+      </w:pPr>
+      <w:r>
+        <w:rPr>
+          <w:b/>
+          <w:color w:val="EE0000"/>
+        </w:rPr>
+        <w:t>13. Immagine e Controimmagine</w:t>
+      </w:r>
+    </w:p>
+    <w:p>
+      <w:pPr>
+        <w:pStyle w:val="Titolo2"/>
+      </w:pPr>
+      <w:r>
+        <w:rPr>
+          <w:b/>
+          <w:color w:val="E97132"/>
+        </w:rPr>
+        <w:t>L'immagine di un elemento e di un sottoinsieme</w:t>
+      </w:r>
+    </w:p>
+    <w:p>
+      <w:r>
+        <w:rPr/>
+        <w:t xml:space="preserve">Sia f : A → B una funzione e a ∈ A. Il valore b = f(a) si chiama </w:t>
+      </w:r>
+      <w:r>
+        <w:rPr>
+          <w:b/>
+        </w:rPr>
+        <w:t>immagine di a</w:t>
+      </w:r>
+      <w:r>
+        <w:rPr/>
+        <w:t>. Il termine non indica necessariamente un numero: è un elemento del codominio, qualunque sia la natura degli insiemi. Per la funzione "quadrato", per esempio, 4 è l'immagine di 2 e 9 è l'immagine di 3.</w:t>
+      </w:r>
+    </w:p>
+    <w:p>
+      <w:r>
+        <w:rPr/>
+        <w:t>La nozione si estende ai sottoinsiemi. Se S ⊆ A, si calcola f su tutti gli elementi di S e si ottiene</w:t>
+      </w:r>
+    </w:p>
+    <w:p>
+      <w:r>
+        <w:rPr/>
+        <w:t>f(S) = {f(s) | s ∈ S} = {b ∈ B | ∃ s ∈ S tale che f(s) = b} ⊆ B,</w:t>
+      </w:r>
+    </w:p>
+    <w:p>
+      <w:r>
+        <w:rPr/>
+        <w:t xml:space="preserve">cioè un sottoinsieme del </w:t>
+      </w:r>
+      <w:r>
+        <w:rPr>
+          <w:b/>
+        </w:rPr>
+        <w:t>codominio</w:t>
+      </w:r>
+      <w:r>
+        <w:rPr/>
+        <w:t>, non di S. Questo insieme è l'</w:t>
+      </w:r>
+      <w:r>
+        <w:rPr>
+          <w:b/>
+        </w:rPr>
+        <w:t>immagine di S</w:t>
+      </w:r>
+      <w:r>
+        <w:rPr/>
+        <w:t xml:space="preserve">. Nel caso S = A si ottiene f(A), detta </w:t>
+      </w:r>
+      <w:r>
+        <w:rPr>
+          <w:b/>
+        </w:rPr>
+        <w:t>immagine (totale)</w:t>
+      </w:r>
+      <w:r>
+        <w:rPr/>
+        <w:t xml:space="preserve"> della funzione e indicata anche con Im(f).</w:t>
+      </w:r>
+    </w:p>
+    <w:p>
+      <w:pPr>
+        <w:pStyle w:val="Titolo2"/>
+      </w:pPr>
+      <w:r>
+        <w:rPr>
+          <w:b/>
+          <w:color w:val="E97132"/>
+        </w:rPr>
+        <w:t>La controimmagine</w:t>
+      </w:r>
+    </w:p>
+    <w:p>
+      <w:r>
+        <w:rPr/>
+        <w:t xml:space="preserve">Si può percorrere la strada inversa: partire dal codominio e chiedersi quali elementi del dominio finiscono lì. Per un sottoinsieme T ⊆ B si definisce la </w:t>
+      </w:r>
+      <w:r>
+        <w:rPr>
+          <w:b/>
+        </w:rPr>
+        <w:t>controimmagine</w:t>
+      </w:r>
+      <w:r>
+        <w:rPr/>
+        <w:t xml:space="preserve"> (o immagine inversa)</w:t>
+      </w:r>
+    </w:p>
+    <w:p>
+      <w:r>
+        <w:rPr/>
+        <w:t>f</w:t>
+      </w:r>
+      <w:r>
+        <w:rPr>
+          <w:vertAlign w:val="superscript"/>
+        </w:rPr>
+        <w:t>-1</w:t>
+      </w:r>
+      <w:r>
+        <w:rPr/>
+        <w:t>(T) = {a ∈ A | f(a) ∈ T} ⊆ A.</w:t>
+      </w:r>
+    </w:p>
+    <w:p>
+      <w:r>
+        <w:rPr/>
+        <w:t>Se T = {b} ha un solo elemento si scrive f</w:t>
+      </w:r>
+      <w:r>
+        <w:rPr>
+          <w:vertAlign w:val="superscript"/>
+        </w:rPr>
+        <w:t>-1</w:t>
+      </w:r>
+      <w:r>
+        <w:rPr/>
+        <w:t xml:space="preserve">(b) = {a ∈ A | f(a) = b}, detta </w:t>
+      </w:r>
+      <w:r>
+        <w:rPr>
+          <w:b/>
+        </w:rPr>
+        <w:t>fibra</w:t>
+      </w:r>
+      <w:r>
+        <w:rPr/>
+        <w:t xml:space="preserve"> di b. Attenzione alla notazione: f</w:t>
+      </w:r>
+      <w:r>
+        <w:rPr>
+          <w:vertAlign w:val="superscript"/>
+        </w:rPr>
+        <w:t>-1</w:t>
+      </w:r>
+      <w:r>
+        <w:rPr/>
+        <w:t xml:space="preserve">(T) esiste per qualunque funzione e </w:t>
+      </w:r>
+      <w:r>
+        <w:rPr>
+          <w:b/>
+        </w:rPr>
+        <w:t>non</w:t>
+      </w:r>
+      <w:r>
+        <w:rPr/>
+        <w:t xml:space="preserve"> significa che f sia invertibile (l'inversa si vedrà nel capitolo 15).</w:t>
+      </w:r>
+    </w:p>
+    <w:p>
+      <w:pPr>
+        <w:pStyle w:val="Titolo2"/>
+      </w:pPr>
+      <w:r>
+        <w:rPr>
+          <w:b/>
+          <w:color w:val="E97132"/>
+        </w:rPr>
+        <w:t>La differenza fondamentale</w:t>
+      </w:r>
+    </w:p>
+    <w:p>
+      <w:r>
+        <w:rPr/>
+        <w:t xml:space="preserve">Un singolo elemento del dominio ha </w:t>
+      </w:r>
+      <w:r>
+        <w:rPr>
+          <w:b/>
+        </w:rPr>
+        <w:t>un'unica</w:t>
+      </w:r>
+      <w:r>
+        <w:rPr/>
+        <w:t xml:space="preserve"> immagine, perché una funzione assume un valore e uno solo su ogni elemento. Un singolo elemento del codominio, invece, può avere </w:t>
+      </w:r>
+      <w:r>
+        <w:rPr>
+          <w:b/>
+        </w:rPr>
+        <w:t>tanti</w:t>
+      </w:r>
+      <w:r>
+        <w:rPr/>
+        <w:t xml:space="preserve"> elementi che lo hanno per immagine. Per questo la controimmagine di un elemento è un </w:t>
+      </w:r>
+      <w:r>
+        <w:rPr>
+          <w:b/>
+        </w:rPr>
+        <w:t>sottoinsieme</w:t>
+      </w:r>
+      <w:r>
+        <w:rPr/>
+        <w:t xml:space="preserve"> di A, non un elemento di A. La scrittura f</w:t>
+      </w:r>
+      <w:r>
+        <w:rPr>
+          <w:vertAlign w:val="superscript"/>
+        </w:rPr>
+        <w:t>-1</w:t>
+      </w:r>
+      <w:r>
+        <w:rPr/>
+        <w:t>(b) va sempre letta come un insieme.</w:t>
+      </w:r>
+    </w:p>
+    <w:p>
+      <w:r>
+        <w:rPr/>
+        <w:t>Due proprietà legate a questo fatto vanno ricordate bene:</w:t>
+      </w:r>
+    </w:p>
+    <w:p>
+      <w:pPr>
+        <w:numPr>
+          <w:ilvl w:val="0"/>
+          <w:numId w:val="1"/>
+        </w:numPr>
+      </w:pPr>
+      <w:r>
+        <w:rPr/>
+        <w:t>se S ≠ ∅, allora f(S) ≠ ∅: l'immagine di un insieme non vuoto non è mai vuota;</w:t>
+      </w:r>
+    </w:p>
+    <w:p>
+      <w:pPr>
+        <w:numPr>
+          <w:ilvl w:val="0"/>
+          <w:numId w:val="1"/>
+        </w:numPr>
+      </w:pPr>
+      <w:r>
+        <w:rPr/>
+        <w:t>al contrario, f</w:t>
+      </w:r>
+      <w:r>
+        <w:rPr>
+          <w:vertAlign w:val="superscript"/>
+        </w:rPr>
+        <w:t>-1</w:t>
+      </w:r>
+      <w:r>
+        <w:rPr/>
+        <w:t>(T) può essere vuota anche se T ≠ ∅, se nessun elemento di A viene mandato in T.</w:t>
+      </w:r>
+    </w:p>
+    <w:p>
+      <w:r>
+        <w:rPr/>
+        <w:t>Poter avere l'insieme vuoto come risultato evita casi particolari: la controimmagine è sempre definita.</w:t>
+      </w:r>
+    </w:p>
+    <w:p>
+      <w:pPr>
+        <w:pStyle w:val="Titolo2"/>
+      </w:pPr>
+      <w:r>
+        <w:rPr>
+          <w:b/>
+          <w:color w:val="E97132"/>
+        </w:rPr>
+        <w:t>Esempio: la parabola f(x) = x²</w:t>
+      </w:r>
+    </w:p>
+    <w:p>
+      <w:r>
+        <w:rPr/>
+        <w:t>Sia f : ℝ → ℝ, f(x) = x². Il grafico è una parabola con vertice nell'origine. Per l'immagine si prende un punto sull'asse x, si guarda il grafico e si proietta sull'asse y. Per la controimmagine si fa il contrario: si parte da un punto b del codominio, si traccia la retta orizzontale e si proiettano sull'asse x i punti in cui incontra il grafico. Tre casi:</w:t>
+      </w:r>
+    </w:p>
+    <w:p>
+      <w:pPr>
+        <w:numPr>
+          <w:ilvl w:val="0"/>
+          <w:numId w:val="1"/>
+        </w:numPr>
+      </w:pPr>
+      <w:r>
+        <w:rPr/>
+        <w:t>se b &gt; 0: f</w:t>
+      </w:r>
+      <w:r>
+        <w:rPr>
+          <w:vertAlign w:val="superscript"/>
+        </w:rPr>
+        <w:t>-1</w:t>
+      </w:r>
+      <w:r>
+        <w:rPr/>
+        <w:t>(b) = {−√b, √b}, due elementi;</w:t>
+      </w:r>
+    </w:p>
+    <w:p>
+      <w:pPr>
+        <w:numPr>
+          <w:ilvl w:val="0"/>
+          <w:numId w:val="1"/>
+        </w:numPr>
+      </w:pPr>
+      <w:r>
+        <w:rPr/>
+        <w:t>se b = 0: f</w:t>
+      </w:r>
+      <w:r>
+        <w:rPr>
+          <w:vertAlign w:val="superscript"/>
+        </w:rPr>
+        <w:t>-1</w:t>
+      </w:r>
+      <w:r>
+        <w:rPr/>
+        <w:t>(0) = {0}, un solo elemento;</w:t>
+      </w:r>
+    </w:p>
+    <w:p>
+      <w:pPr>
+        <w:numPr>
+          <w:ilvl w:val="0"/>
+          <w:numId w:val="1"/>
+        </w:numPr>
+      </w:pPr>
+      <w:r>
+        <w:rPr/>
+        <w:t>se b &lt; 0: f</w:t>
+      </w:r>
+      <w:r>
+        <w:rPr>
+          <w:vertAlign w:val="superscript"/>
+        </w:rPr>
+        <w:t>-1</w:t>
+      </w:r>
+      <w:r>
+        <w:rPr/>
+        <w:t>(b) = ∅, perché nessun numero reale ha quadrato negativo.</w:t>
+      </w:r>
+    </w:p>
+    <w:p>
+      <w:r>
+        <w:rPr/>
+        <w:t>Anche per i sottoinsiemi il ragionamento regge. Per T = [0, 4]: x² ∈ [0, 4] equivale a −2 ≤ x ≤ 2, quindi f</w:t>
+      </w:r>
+      <w:r>
+        <w:rPr>
+          <w:vertAlign w:val="superscript"/>
+        </w:rPr>
+        <w:t>-1</w:t>
+      </w:r>
+      <w:r>
+        <w:rPr/>
+        <w:t>([0, 4]) = [−2, 2]. Per T = [−1, 4] il risultato è lo stesso, [−2, 2]: la parte [−1, 0) del sottoinsieme non viene mai raggiunta dalla funzione, perché i quadrati sono sempre non negativi, quindi non aggiunge nulla.</w:t>
+      </w:r>
+    </w:p>
+    <w:p>
+      <w:pPr>
+        <w:pStyle w:val="Titolo2"/>
+      </w:pPr>
+      <w:r>
+        <w:rPr>
+          <w:b/>
+          <w:color w:val="E97132"/>
+        </w:rPr>
+        <w:t>Calcolare immagini e controimmagini</w:t>
+      </w:r>
+    </w:p>
+    <w:p>
+      <w:r>
+        <w:rPr/>
+        <w:t xml:space="preserve">Calcolare un'immagine, quando si ha un'espressione, significa sostituire il valore nell'espressione. Calcolare una controimmagine è più difficile: bisogna </w:t>
+      </w:r>
+      <w:r>
+        <w:rPr>
+          <w:b/>
+        </w:rPr>
+        <w:t>risolvere l'equazione</w:t>
+      </w:r>
+      <w:r>
+        <w:rPr/>
+        <w:t xml:space="preserve"> f(x) = y nell'incognita x, e in certi casi risolverla può essere impossibile da fare esplicitamente. Il caso è concettualmente più difficile anche quando le funzioni non sono numeriche: se a ogni persona di un gruppo associamo la sua altezza in centimetri, la controimmagine di 170 è il sottoinsieme delle persone del gruppo alte esattamente 170 cm, che può avere molti elementi, uno solo o nessuno.</w:t>
+      </w:r>
+    </w:p>
+    <w:p>
+      <w:r>
+        <w:rPr/>
+        <w:t>Con queste due nozioni possiamo classificare le funzioni in base a come "coprono" il codominio e a come si comportano su elementi distinti.</w:t>
+      </w:r>
+    </w:p>
+    <w:p>
+      <w:pPr>
+        <w:pStyle w:val="Titolo1"/>
+      </w:pPr>
+      <w:r>
+        <w:rPr>
+          <w:b/>
+          <w:color w:val="EE0000"/>
+        </w:rPr>
+        <w:t>14. Funzioni Suriettive, Iniettive e Biettive</w:t>
+      </w:r>
+    </w:p>
+    <w:p>
+      <w:pPr>
+        <w:pStyle w:val="Titolo2"/>
+      </w:pPr>
+      <w:r>
+        <w:rPr>
+          <w:b/>
+          <w:color w:val="E97132"/>
+        </w:rPr>
+        <w:t>Suriettività</w:t>
+      </w:r>
+    </w:p>
+    <w:p>
+      <w:r>
+        <w:rPr/>
+        <w:t xml:space="preserve">Una funzione f : A → B è </w:t>
+      </w:r>
+      <w:r>
+        <w:rPr>
+          <w:b/>
+        </w:rPr>
+        <w:t>suriettiva</w:t>
+      </w:r>
+      <w:r>
+        <w:rPr/>
+        <w:t xml:space="preserve"> se la sua immagine totale è tutto il codominio, cioè se f(A) = B: ogni elemento di B è raggiungibile dalla funzione partendo da qualche elemento del dominio. Si può scrivere in modi equivalenti:</w:t>
+      </w:r>
+    </w:p>
+    <w:p>
+      <w:pPr>
+        <w:numPr>
+          <w:ilvl w:val="0"/>
+          <w:numId w:val="1"/>
+        </w:numPr>
+      </w:pPr>
+      <w:r>
+        <w:rPr/>
+        <w:t>∀ b ∈ B, ∃ a ∈ A tale che f(a) = b;</w:t>
+      </w:r>
+    </w:p>
+    <w:p>
+      <w:pPr>
+        <w:numPr>
+          <w:ilvl w:val="0"/>
+          <w:numId w:val="1"/>
+        </w:numPr>
+      </w:pPr>
+      <w:r>
+        <w:rPr/>
+        <w:t>∀ b ∈ B, f</w:t>
+      </w:r>
+      <w:r>
+        <w:rPr>
+          <w:vertAlign w:val="superscript"/>
+        </w:rPr>
+        <w:t>-1</w:t>
+      </w:r>
+      <w:r>
+        <w:rPr/>
+        <w:t>(b) ≠ ∅: ogni elemento del codominio ha almeno una controimmagine.</w:t>
+      </w:r>
+    </w:p>
+    <w:p>
+      <w:pPr>
+        <w:pStyle w:val="Titolo2"/>
+      </w:pPr>
+      <w:r>
+        <w:rPr>
+          <w:b/>
+          <w:color w:val="E97132"/>
+        </w:rPr>
+        <w:t>Iniettività</w:t>
+      </w:r>
+    </w:p>
+    <w:p>
+      <w:r>
+        <w:rPr/>
+        <w:t xml:space="preserve">Una funzione f è </w:t>
+      </w:r>
+      <w:r>
+        <w:rPr>
+          <w:b/>
+        </w:rPr>
+        <w:t>iniettiva</w:t>
+      </w:r>
+      <w:r>
+        <w:rPr/>
+        <w:t xml:space="preserve"> se elementi distinti del dominio hanno immagini distinte:</w:t>
+      </w:r>
+    </w:p>
+    <w:p>
+      <w:r>
+        <w:rPr/>
+        <w:t>∀ a₁, a₂ ∈ A, a₁ ≠ a₂ ⟹ f(a₁) ≠ f(a₂).</w:t>
+      </w:r>
+    </w:p>
+    <w:p>
+      <w:r>
+        <w:rPr/>
+        <w:t>In termini di controimmagini: ∀ b ∈ B, |f</w:t>
+      </w:r>
+      <w:r>
+        <w:rPr>
+          <w:vertAlign w:val="superscript"/>
+        </w:rPr>
+        <w:t>-1</w:t>
+      </w:r>
+      <w:r>
+        <w:rPr/>
+        <w:t>(b)| ≤ 1, cioè nessun elemento del codominio viene raggiunto da due elementi diversi del dominio. Nel disegno con le frecce, f non è iniettiva quando due frecce partenti da punti diversi arrivano nello stesso punto.</w:t>
+      </w:r>
+    </w:p>
+    <w:p>
+      <w:r>
+        <w:rPr/>
+        <w:t xml:space="preserve">Per dimostrare che f </w:t>
+      </w:r>
+      <w:r>
+        <w:rPr>
+          <w:b/>
+        </w:rPr>
+        <w:t>non</w:t>
+      </w:r>
+      <w:r>
+        <w:rPr/>
+        <w:t xml:space="preserve"> è iniettiva basta mostrare che esistono due elementi diversi del dominio con la stessa immagine: negando la proposizione, il suo contrario è "esistono a₁ ≠ a₂ con f(a₁) = f(a₂)". Un controesempio basta.</w:t>
+      </w:r>
+    </w:p>
+    <w:p>
+      <w:pPr>
+        <w:pStyle w:val="Titolo2"/>
+      </w:pPr>
+      <w:r>
+        <w:rPr>
+          <w:b/>
+          <w:color w:val="E97132"/>
+        </w:rPr>
+        <w:t>Biettività</w:t>
+      </w:r>
+    </w:p>
+    <w:p>
+      <w:r>
+        <w:rPr/>
+        <w:t xml:space="preserve">f è </w:t>
+      </w:r>
+      <w:r>
+        <w:rPr>
+          <w:b/>
+        </w:rPr>
+        <w:t>biettiva</w:t>
+      </w:r>
+      <w:r>
+        <w:rPr/>
+        <w:t xml:space="preserve"> (o corrispondenza biunivoca) se è sia iniettiva sia suriettiva, cioè ∀ b ∈ B, |f</w:t>
+      </w:r>
+      <w:r>
+        <w:rPr>
+          <w:vertAlign w:val="superscript"/>
+        </w:rPr>
+        <w:t>-1</w:t>
+      </w:r>
+      <w:r>
+        <w:rPr/>
+        <w:t>(b)| = 1: ogni elemento del codominio ha esattamente una controimmagine. Equivalentemente, ∀ b ∈ B ∃! a ∈ A con f(a) = b.</w:t>
+      </w:r>
+    </w:p>
+    <w:p>
+      <w:pPr>
+        <w:pStyle w:val="Titolo2"/>
+      </w:pPr>
+      <w:r>
+        <w:rPr>
+          <w:b/>
+          <w:color w:val="E97132"/>
+        </w:rPr>
+        <w:t>Il ruolo di dominio e codominio</w:t>
+      </w:r>
+    </w:p>
+    <w:p>
+      <w:r>
+        <w:rPr/>
+        <w:t>Prendiamo f(x) = x². Come funzione ℝ → ℝ:</w:t>
+      </w:r>
+    </w:p>
+    <w:p>
+      <w:pPr>
+        <w:numPr>
+          <w:ilvl w:val="0"/>
+          <w:numId w:val="1"/>
+        </w:numPr>
+      </w:pPr>
+      <w:r>
+        <w:rPr/>
+        <w:t>non è iniettiva, perché f(−1) = f(1) = 1 pur essendo −1 ≠ 1;</w:t>
+      </w:r>
+    </w:p>
+    <w:p>
+      <w:pPr>
+        <w:numPr>
+          <w:ilvl w:val="0"/>
+          <w:numId w:val="1"/>
+        </w:numPr>
+      </w:pPr>
+      <w:r>
+        <w:rPr/>
+        <w:t>non è suriettiva, perché i numeri negativi non hanno controimmagine (per esempio f</w:t>
+      </w:r>
+      <w:r>
+        <w:rPr>
+          <w:vertAlign w:val="superscript"/>
+        </w:rPr>
+        <w:t>-1</w:t>
+      </w:r>
+      <w:r>
+        <w:rPr/>
+        <w:t>(−4) = ∅) e quindi Im(f) = [0, +∞) ≠ ℝ.</w:t>
+      </w:r>
+    </w:p>
+    <w:p>
+      <w:r>
+        <w:rPr/>
+        <w:t xml:space="preserve">Se cambiamo il codominio e consideriamo g : ℝ → [0, +∞), g(x) = x², la funzione </w:t>
+      </w:r>
+      <w:r>
+        <w:rPr>
+          <w:b/>
+        </w:rPr>
+        <w:t>diventa suriettiva</w:t>
+      </w:r>
+      <w:r>
+        <w:rPr/>
+        <w:t>: i numeri negativi non sono più nel codominio e ogni numero non negativo è un quadrato. Se restringiamo anche il dominio a [0, +∞), cioè q : [0, +∞) → [0, +∞), q(x) = x², diventa biettiva. L'espressione è sempre la stessa, ma abbiamo cambiato uno dei tre ingredienti: la funzione è diversa, e infatti ha una proprietà che l'altra non ha.</w:t>
+      </w:r>
+    </w:p>
+    <w:p>
+      <w:pPr>
+        <w:pStyle w:val="Titolo2"/>
+      </w:pPr>
+      <w:r>
+        <w:rPr>
+          <w:b/>
+          <w:color w:val="E97132"/>
+        </w:rPr>
+        <w:t>Altri esempi</w:t>
+      </w:r>
+    </w:p>
+    <w:p>
+      <w:pPr>
+        <w:numPr>
+          <w:ilvl w:val="0"/>
+          <w:numId w:val="1"/>
+        </w:numPr>
+      </w:pPr>
+      <w:r>
+        <w:rPr/>
+        <w:t xml:space="preserve">h : ℤ → ℤ, h(n) = 2n + 1 è </w:t>
+      </w:r>
+      <w:r>
+        <w:rPr>
+          <w:b/>
+        </w:rPr>
+        <w:t>iniettiva</w:t>
+      </w:r>
+      <w:r>
+        <w:rPr/>
+        <w:t>: da 2n₁ + 1 = 2n₂ + 1 segue 2n₁ = 2n₂ e quindi n₁ = n₂. Non è suriettiva: l'immagine è l'insieme dei numeri dispari e i pari non hanno controimmagine in ℤ.</w:t>
+      </w:r>
+    </w:p>
+    <w:p>
+      <w:pPr>
+        <w:numPr>
+          <w:ilvl w:val="0"/>
+          <w:numId w:val="1"/>
+        </w:numPr>
+      </w:pPr>
+      <w:r>
+        <w:rPr/>
+        <w:t xml:space="preserve">k : ℝ → ℝ, k(x) = x³ è </w:t>
+      </w:r>
+      <w:r>
+        <w:rPr>
+          <w:b/>
+        </w:rPr>
+        <w:t>biettiva</w:t>
+      </w:r>
+      <w:r>
+        <w:rPr/>
+        <w:t>: ogni numero reale ha un'unica radice cubica reale.</w:t>
+      </w:r>
+    </w:p>
+    <w:p>
+      <w:r>
+        <w:rPr>
+          <w:b/>
+        </w:rPr>
+        <w:t>Come sottolineato a lezione:</w:t>
+      </w:r>
+      <w:r>
+        <w:rPr/>
+        <w:t xml:space="preserve"> prima di dire se una funzione è iniettiva o suriettiva bisogna leggere con cura dominio e codominio: la stessa espressione può essere suriettiva o no a seconda dell'insieme di arrivo, e iniettiva o no a seconda dell'insieme di partenza.</w:t>
+      </w:r>
+    </w:p>
+    <w:p>
+      <w:r>
+        <w:rPr/>
+        <w:t>Con queste proprietà possiamo parlare di funzioni composte e di funzioni inverse.</w:t>
+      </w:r>
+    </w:p>
+    <w:p>
+      <w:pPr>
+        <w:pStyle w:val="Titolo1"/>
+      </w:pPr>
+      <w:r>
+        <w:rPr>
+          <w:b/>
+          <w:color w:val="EE0000"/>
+        </w:rPr>
+        <w:t>15. Composizione e Invertibilità</w:t>
+      </w:r>
+    </w:p>
+    <w:p>
+      <w:pPr>
+        <w:pStyle w:val="Titolo2"/>
+      </w:pPr>
+      <w:r>
+        <w:rPr>
+          <w:b/>
+          <w:color w:val="E97132"/>
+        </w:rPr>
+        <w:t>La funzione composta</w:t>
+      </w:r>
+    </w:p>
+    <w:p>
+      <w:r>
+        <w:rPr/>
+        <w:t xml:space="preserve">Siano f : A → B e g : B → C due funzioni, in modo che il codominio di f coincida con il dominio di g (in generale basta che il codominio di f sia contenuto nel dominio di g). La </w:t>
+      </w:r>
+      <w:r>
+        <w:rPr>
+          <w:b/>
+        </w:rPr>
+        <w:t>composizione</w:t>
+      </w:r>
+      <w:r>
+        <w:rPr/>
+        <w:t xml:space="preserve"> è la funzione g ∘ f : A → C definita da</w:t>
+      </w:r>
+    </w:p>
+    <w:p>
+      <w:r>
+        <w:rPr/>
+        <w:t>(g ∘ f)(a) = g(f(a)) per ogni a ∈ A.</w:t>
+      </w:r>
+    </w:p>
+    <w:p>
+      <w:r>
+        <w:rPr/>
+        <w:t>Prima si applica f, poi g: la scrittura va letta da destra a sinistra.</w:t>
+      </w:r>
+    </w:p>
+    <w:p>
+      <w:r>
+        <w:rPr/>
+        <w:t>Proprietà:</w:t>
+      </w:r>
+    </w:p>
+    <w:p>
+      <w:pPr>
+        <w:numPr>
+          <w:ilvl w:val="0"/>
+          <w:numId w:val="1"/>
+        </w:numPr>
+      </w:pPr>
+      <w:r>
+        <w:rPr>
+          <w:b/>
+        </w:rPr>
+        <w:t>associatività</w:t>
+      </w:r>
+      <w:r>
+        <w:rPr/>
+        <w:t>: se h : C → D, allora h ∘ (g ∘ f) = (h ∘ g) ∘ f;</w:t>
+      </w:r>
+    </w:p>
+    <w:p>
+      <w:pPr>
+        <w:numPr>
+          <w:ilvl w:val="0"/>
+          <w:numId w:val="1"/>
+        </w:numPr>
+      </w:pPr>
+      <w:r>
+        <w:rPr>
+          <w:b/>
+        </w:rPr>
+        <w:t>elemento neutro</w:t>
+      </w:r>
+      <w:r>
+        <w:rPr/>
+        <w:t>: f ∘ id</w:t>
+      </w:r>
+      <w:r>
+        <w:rPr>
+          <w:vertAlign w:val="subscript"/>
+        </w:rPr>
+        <w:t>A</w:t>
+      </w:r>
+      <w:r>
+        <w:rPr/>
+        <w:t xml:space="preserve"> = f e id</w:t>
+      </w:r>
+      <w:r>
+        <w:rPr>
+          <w:vertAlign w:val="subscript"/>
+        </w:rPr>
+        <w:t>B</w:t>
+      </w:r>
+      <w:r>
+        <w:rPr/>
+        <w:t xml:space="preserve"> ∘ f = f;</w:t>
+      </w:r>
+    </w:p>
+    <w:p>
+      <w:pPr>
+        <w:numPr>
+          <w:ilvl w:val="0"/>
+          <w:numId w:val="1"/>
+        </w:numPr>
+      </w:pPr>
+      <w:r>
+        <w:rPr>
+          <w:b/>
+        </w:rPr>
+        <w:t>non commutatività</w:t>
+      </w:r>
+      <w:r>
+        <w:rPr/>
+        <w:t>: in generale g ∘ f ≠ f ∘ g, e spesso f ∘ g non è nemmeno definibile.</w:t>
+      </w:r>
+    </w:p>
+    <w:p>
+      <w:r>
+        <w:rPr/>
+        <w:t>Un esempio: con f(x) = x² e g(x) = x + 1 da ℝ in ℝ si ha (g ∘ f)(x) = x² + 1, mentre (f ∘ g)(x) = (x + 1)² = x² + 2x + 1, che sono funzioni diverse.</w:t>
+      </w:r>
+    </w:p>
+    <w:p>
+      <w:pPr>
+        <w:pStyle w:val="Titolo2"/>
+      </w:pPr>
+      <w:r>
+        <w:rPr>
+          <w:b/>
+          <w:color w:val="E97132"/>
+        </w:rPr>
+        <w:t>Funzione invertibile</w:t>
+      </w:r>
+    </w:p>
+    <w:p>
+      <w:r>
+        <w:rPr/>
+        <w:t xml:space="preserve">Una funzione f : A → B è </w:t>
+      </w:r>
+      <w:r>
+        <w:rPr>
+          <w:b/>
+        </w:rPr>
+        <w:t>invertibile</w:t>
+      </w:r>
+      <w:r>
+        <w:rPr/>
+        <w:t xml:space="preserve"> se esiste g : B → A tale che g ∘ f = id</w:t>
+      </w:r>
+      <w:r>
+        <w:rPr>
+          <w:vertAlign w:val="subscript"/>
+        </w:rPr>
+        <w:t>A</w:t>
+      </w:r>
+      <w:r>
+        <w:rPr/>
+        <w:t xml:space="preserve"> e f ∘ g = id</w:t>
+      </w:r>
+      <w:r>
+        <w:rPr>
+          <w:vertAlign w:val="subscript"/>
+        </w:rPr>
+        <w:t>B</w:t>
+      </w:r>
+      <w:r>
+        <w:rPr/>
+        <w:t>. Vale il teorema fondamentale:</w:t>
+      </w:r>
+    </w:p>
+    <w:p>
+      <w:r>
+        <w:rPr>
+          <w:b/>
+        </w:rPr>
+        <w:t>f è invertibile se e solo se f è biettiva.</w:t>
+      </w:r>
+    </w:p>
+    <w:p>
+      <w:r>
+        <w:rPr/>
+        <w:t xml:space="preserve">Se f è biettiva, la funzione g è unica; si chiama </w:t>
+      </w:r>
+      <w:r>
+        <w:rPr>
+          <w:b/>
+        </w:rPr>
+        <w:t>funzione inversa</w:t>
+      </w:r>
+      <w:r>
+        <w:rPr/>
+        <w:t>, si indica con f</w:t>
+      </w:r>
+      <w:r>
+        <w:rPr>
+          <w:vertAlign w:val="superscript"/>
+        </w:rPr>
+        <w:t>-1</w:t>
+      </w:r>
+      <w:r>
+        <w:rPr/>
+        <w:t xml:space="preserve"> : B → A ed è definita da f</w:t>
+      </w:r>
+      <w:r>
+        <w:rPr>
+          <w:vertAlign w:val="superscript"/>
+        </w:rPr>
+        <w:t>-1</w:t>
+      </w:r>
+      <w:r>
+        <w:rPr/>
+        <w:t>(b) = a ⟺ f(a) = b. Per esempio k(x) = x³ da ℝ in ℝ è biettiva e la sua inversa è k</w:t>
+      </w:r>
+      <w:r>
+        <w:rPr>
+          <w:vertAlign w:val="superscript"/>
+        </w:rPr>
+        <w:t>-1</w:t>
+      </w:r>
+      <w:r>
+        <w:rPr/>
+        <w:t>(x) = ∛x, mentre h(n) = 2n + 1 da ℤ in ℤ non è biettiva (non è suriettiva), quindi non è invertibile.</w:t>
+      </w:r>
+    </w:p>
+    <w:p>
+      <w:r>
+        <w:rPr/>
+        <w:t>Non va confusa la funzione inversa f</w:t>
+      </w:r>
+      <w:r>
+        <w:rPr>
+          <w:vertAlign w:val="superscript"/>
+        </w:rPr>
+        <w:t>-1</w:t>
+      </w:r>
+      <w:r>
+        <w:rPr/>
+        <w:t xml:space="preserve"> (che esiste solo se f è biettiva) con la controimmagine f</w:t>
+      </w:r>
+      <w:r>
+        <w:rPr>
+          <w:vertAlign w:val="superscript"/>
+        </w:rPr>
+        <w:t>-1</w:t>
+      </w:r>
+      <w:r>
+        <w:rPr/>
+        <w:t>(T) del capitolo 13, che si può calcolare per qualunque funzione.</w:t>
       </w:r>
     </w:p>
     <w:sectPr>

</xml_diff>